<commit_message>
doc: Added the required skills report
</commit_message>
<xml_diff>
--- a/public/docs/GroupB_DescriptionsheetAndRequiredSkills.docx
+++ b/public/docs/GroupB_DescriptionsheetAndRequiredSkills.docx
@@ -260,7 +260,7 @@
             </w:rPr>
             <w:fldChar w:fldCharType="separate"/>
           </w:r>
-          <w:hyperlink w:anchor="_Toc233274078" w:history="1">
+          <w:hyperlink w:anchor="_Toc233310032" w:history="1">
             <w:r>
               <w:rPr>
                 <w:rStyle w:val="Lienhypertexte"/>
@@ -307,7 +307,7 @@
                 <w:noProof/>
                 <w:webHidden/>
               </w:rPr>
-              <w:instrText xml:space="preserve"> PAGEREF _Toc233274078 \h </w:instrText>
+              <w:instrText xml:space="preserve"> PAGEREF _Toc233310032 \h </w:instrText>
             </w:r>
             <w:r>
               <w:rPr>
@@ -352,7 +352,7 @@
               <w14:ligatures w14:val="standardContextual"/>
             </w:rPr>
           </w:pPr>
-          <w:hyperlink w:anchor="_Toc233274079" w:history="1">
+          <w:hyperlink w:anchor="_Toc233310033" w:history="1">
             <w:r>
               <w:rPr>
                 <w:rStyle w:val="Lienhypertexte"/>
@@ -378,7 +378,7 @@
                 <w:rStyle w:val="Lienhypertexte"/>
                 <w:noProof/>
               </w:rPr>
-              <w:t>Outcome</w:t>
+              <w:t>Links</w:t>
             </w:r>
             <w:r>
               <w:rPr>
@@ -399,7 +399,7 @@
                 <w:noProof/>
                 <w:webHidden/>
               </w:rPr>
-              <w:instrText xml:space="preserve"> PAGEREF _Toc233274079 \h </w:instrText>
+              <w:instrText xml:space="preserve"> PAGEREF _Toc233310033 \h </w:instrText>
             </w:r>
             <w:r>
               <w:rPr>
@@ -419,99 +419,7 @@
                 <w:noProof/>
                 <w:webHidden/>
               </w:rPr>
-              <w:t>4</w:t>
-            </w:r>
-            <w:r>
-              <w:rPr>
-                <w:noProof/>
-                <w:webHidden/>
-              </w:rPr>
-              <w:fldChar w:fldCharType="end"/>
-            </w:r>
-          </w:hyperlink>
-        </w:p>
-        <w:p>
-          <w:pPr>
-            <w:pStyle w:val="TM1"/>
-            <w:rPr>
-              <w:rFonts w:asciiTheme="minorHAnsi" w:eastAsiaTheme="minorEastAsia" w:hAnsiTheme="minorHAnsi" w:cstheme="minorBidi"/>
-              <w:b w:val="0"/>
-              <w:noProof/>
-              <w:kern w:val="2"/>
-              <w:sz w:val="24"/>
-              <w:szCs w:val="24"/>
-              <w:lang w:val="fr-CH" w:eastAsia="fr-CH"/>
-              <w14:ligatures w14:val="standardContextual"/>
-            </w:rPr>
-          </w:pPr>
-          <w:hyperlink w:anchor="_Toc233274080" w:history="1">
-            <w:r>
-              <w:rPr>
-                <w:rStyle w:val="Lienhypertexte"/>
-                <w:noProof/>
-              </w:rPr>
-              <w:t>3</w:t>
-            </w:r>
-            <w:r>
-              <w:rPr>
-                <w:rFonts w:asciiTheme="minorHAnsi" w:eastAsiaTheme="minorEastAsia" w:hAnsiTheme="minorHAnsi" w:cstheme="minorBidi"/>
-                <w:b w:val="0"/>
-                <w:noProof/>
-                <w:kern w:val="2"/>
-                <w:sz w:val="24"/>
-                <w:szCs w:val="24"/>
-                <w:lang w:val="fr-CH" w:eastAsia="fr-CH"/>
-                <w14:ligatures w14:val="standardContextual"/>
-              </w:rPr>
-              <w:tab/>
-            </w:r>
-            <w:r>
-              <w:rPr>
-                <w:rStyle w:val="Lienhypertexte"/>
-                <w:noProof/>
-              </w:rPr>
-              <w:t>Links</w:t>
-            </w:r>
-            <w:r>
-              <w:rPr>
-                <w:noProof/>
-                <w:webHidden/>
-              </w:rPr>
-              <w:tab/>
-            </w:r>
-            <w:r>
-              <w:rPr>
-                <w:noProof/>
-                <w:webHidden/>
-              </w:rPr>
-              <w:fldChar w:fldCharType="begin"/>
-            </w:r>
-            <w:r>
-              <w:rPr>
-                <w:noProof/>
-                <w:webHidden/>
-              </w:rPr>
-              <w:instrText xml:space="preserve"> PAGEREF _Toc233274080 \h </w:instrText>
-            </w:r>
-            <w:r>
-              <w:rPr>
-                <w:noProof/>
-                <w:webHidden/>
-              </w:rPr>
-            </w:r>
-            <w:r>
-              <w:rPr>
-                <w:noProof/>
-                <w:webHidden/>
-              </w:rPr>
-              <w:fldChar w:fldCharType="separate"/>
-            </w:r>
-            <w:r>
-              <w:rPr>
-                <w:noProof/>
-                <w:webHidden/>
-              </w:rPr>
-              <w:t>4</w:t>
+              <w:t>5</w:t>
             </w:r>
             <w:r>
               <w:rPr>
@@ -563,7 +471,7 @@
       <w:pPr>
         <w:pStyle w:val="Titre1"/>
       </w:pPr>
-      <w:bookmarkStart w:id="0" w:name="_Toc233274078"/>
+      <w:bookmarkStart w:id="0" w:name="_Toc233310032"/>
       <w:r>
         <w:t>Indications of the integrated competencies and their location in the code</w:t>
       </w:r>
@@ -2070,6 +1978,7 @@
                 <w:lang w:val="en-US"/>
               </w:rPr>
             </w:pPr>
+            <w:proofErr w:type="spellStart"/>
             <w:r>
               <w:rPr>
                 <w:i/>
@@ -2078,15 +1987,9 @@
                 <w:szCs w:val="20"/>
                 <w:lang w:val="en-US"/>
               </w:rPr>
-              <w:t>file.js</w:t>
-            </w:r>
-          </w:p>
-          <w:p>
-            <w:pPr>
-              <w:rPr>
-                <w:lang w:val="en-US"/>
-              </w:rPr>
-            </w:pPr>
+              <w:t>js</w:t>
+            </w:r>
+            <w:proofErr w:type="spellEnd"/>
             <w:r>
               <w:rPr>
                 <w:i/>
@@ -2095,7 +1998,7 @@
                 <w:szCs w:val="20"/>
                 <w:lang w:val="en-US"/>
               </w:rPr>
-              <w:t>line</w:t>
+              <w:t>/projectile.js</w:t>
             </w:r>
             <w:r>
               <w:rPr>
@@ -2105,7 +2008,36 @@
                 <w:szCs w:val="20"/>
                 <w:lang w:val="en-US"/>
               </w:rPr>
-              <w:t>: XXX</w:t>
+              <w:t xml:space="preserve"> (l.37, 48)</w:t>
+            </w:r>
+          </w:p>
+          <w:p>
+            <w:pPr>
+              <w:rPr>
+                <w:lang w:val="en-US"/>
+              </w:rPr>
+            </w:pPr>
+            <w:proofErr w:type="spellStart"/>
+            <w:r>
+              <w:rPr>
+                <w:i/>
+                <w:iCs/>
+                <w:sz w:val="20"/>
+                <w:szCs w:val="20"/>
+                <w:lang w:val="en-US"/>
+              </w:rPr>
+              <w:t>js</w:t>
+            </w:r>
+            <w:proofErr w:type="spellEnd"/>
+            <w:r>
+              <w:rPr>
+                <w:i/>
+                <w:iCs/>
+                <w:sz w:val="20"/>
+                <w:szCs w:val="20"/>
+                <w:lang w:val="en-US"/>
+              </w:rPr>
+              <w:t>/game.js (l.21)</w:t>
             </w:r>
           </w:p>
         </w:tc>
@@ -2166,12 +2098,152 @@
             </w:pPr>
             <w:r>
               <w:rPr>
-                <w:noProof/>
-                <w:highlight w:val="red"/>
-                <w:lang w:val="en-US"/>
-              </w:rPr>
-              <w:t>Your screenshot</w:t>
-            </w:r>
+                <w:lang w:val="en-US"/>
+              </w:rPr>
+              <w:drawing>
+                <wp:inline distT="0" distB="0" distL="0" distR="0" wp14:anchorId="0DACC5C9" wp14:editId="382C76C1">
+                  <wp:extent cx="3947502" cy="190517"/>
+                  <wp:effectExtent l="0" t="0" r="0" b="0"/>
+                  <wp:docPr id="22033927" name="Image 1"/>
+                  <wp:cNvGraphicFramePr>
+                    <a:graphicFrameLocks xmlns:a="http://schemas.openxmlformats.org/drawingml/2006/main" noChangeAspect="1"/>
+                  </wp:cNvGraphicFramePr>
+                  <a:graphic xmlns:a="http://schemas.openxmlformats.org/drawingml/2006/main">
+                    <a:graphicData uri="http://schemas.openxmlformats.org/drawingml/2006/picture">
+                      <pic:pic xmlns:pic="http://schemas.openxmlformats.org/drawingml/2006/picture">
+                        <pic:nvPicPr>
+                          <pic:cNvPr id="22033927" name=""/>
+                          <pic:cNvPicPr/>
+                        </pic:nvPicPr>
+                        <pic:blipFill>
+                          <a:blip r:embed="rId18"/>
+                          <a:stretch>
+                            <a:fillRect/>
+                          </a:stretch>
+                        </pic:blipFill>
+                        <pic:spPr>
+                          <a:xfrm>
+                            <a:off x="0" y="0"/>
+                            <a:ext cx="3947502" cy="190517"/>
+                          </a:xfrm>
+                          <a:prstGeom prst="rect">
+                            <a:avLst/>
+                          </a:prstGeom>
+                        </pic:spPr>
+                      </pic:pic>
+                    </a:graphicData>
+                  </a:graphic>
+                </wp:inline>
+              </w:drawing>
+            </w:r>
+          </w:p>
+          <w:p>
+            <w:pPr>
+              <w:rPr>
+                <w:lang w:val="en-US"/>
+              </w:rPr>
+            </w:pPr>
+            <w:r>
+              <w:rPr>
+                <w:lang w:val="en-US"/>
+              </w:rPr>
+              <w:drawing>
+                <wp:inline distT="0" distB="0" distL="0" distR="0" wp14:anchorId="25CC943F" wp14:editId="345FFB52">
+                  <wp:extent cx="2911092" cy="175275"/>
+                  <wp:effectExtent l="0" t="0" r="3810" b="0"/>
+                  <wp:docPr id="183764218" name="Image 1"/>
+                  <wp:cNvGraphicFramePr>
+                    <a:graphicFrameLocks xmlns:a="http://schemas.openxmlformats.org/drawingml/2006/main" noChangeAspect="1"/>
+                  </wp:cNvGraphicFramePr>
+                  <a:graphic xmlns:a="http://schemas.openxmlformats.org/drawingml/2006/main">
+                    <a:graphicData uri="http://schemas.openxmlformats.org/drawingml/2006/picture">
+                      <pic:pic xmlns:pic="http://schemas.openxmlformats.org/drawingml/2006/picture">
+                        <pic:nvPicPr>
+                          <pic:cNvPr id="183764218" name=""/>
+                          <pic:cNvPicPr/>
+                        </pic:nvPicPr>
+                        <pic:blipFill>
+                          <a:blip r:embed="rId19"/>
+                          <a:stretch>
+                            <a:fillRect/>
+                          </a:stretch>
+                        </pic:blipFill>
+                        <pic:spPr>
+                          <a:xfrm>
+                            <a:off x="0" y="0"/>
+                            <a:ext cx="2911092" cy="175275"/>
+                          </a:xfrm>
+                          <a:prstGeom prst="rect">
+                            <a:avLst/>
+                          </a:prstGeom>
+                        </pic:spPr>
+                      </pic:pic>
+                    </a:graphicData>
+                  </a:graphic>
+                </wp:inline>
+              </w:drawing>
+            </w:r>
+          </w:p>
+          <w:p>
+            <w:pPr>
+              <w:rPr>
+                <w:lang w:val="en-US"/>
+              </w:rPr>
+            </w:pPr>
+            <w:r>
+              <w:rPr>
+                <w:lang w:val="en-US"/>
+              </w:rPr>
+              <w:drawing>
+                <wp:inline distT="0" distB="0" distL="0" distR="0" wp14:anchorId="13843717" wp14:editId="52421C8F">
+                  <wp:extent cx="3863675" cy="205758"/>
+                  <wp:effectExtent l="0" t="0" r="3810" b="3810"/>
+                  <wp:docPr id="493851538" name="Image 1"/>
+                  <wp:cNvGraphicFramePr>
+                    <a:graphicFrameLocks xmlns:a="http://schemas.openxmlformats.org/drawingml/2006/main" noChangeAspect="1"/>
+                  </wp:cNvGraphicFramePr>
+                  <a:graphic xmlns:a="http://schemas.openxmlformats.org/drawingml/2006/main">
+                    <a:graphicData uri="http://schemas.openxmlformats.org/drawingml/2006/picture">
+                      <pic:pic xmlns:pic="http://schemas.openxmlformats.org/drawingml/2006/picture">
+                        <pic:nvPicPr>
+                          <pic:cNvPr id="493851538" name=""/>
+                          <pic:cNvPicPr/>
+                        </pic:nvPicPr>
+                        <pic:blipFill>
+                          <a:blip r:embed="rId20"/>
+                          <a:stretch>
+                            <a:fillRect/>
+                          </a:stretch>
+                        </pic:blipFill>
+                        <pic:spPr>
+                          <a:xfrm>
+                            <a:off x="0" y="0"/>
+                            <a:ext cx="3863675" cy="205758"/>
+                          </a:xfrm>
+                          <a:prstGeom prst="rect">
+                            <a:avLst/>
+                          </a:prstGeom>
+                        </pic:spPr>
+                      </pic:pic>
+                    </a:graphicData>
+                  </a:graphic>
+                </wp:inline>
+              </w:drawing>
+            </w:r>
+          </w:p>
+          <w:p>
+            <w:pPr>
+              <w:rPr>
+                <w:lang w:val="en-US"/>
+              </w:rPr>
+            </w:pPr>
+          </w:p>
+          <w:p>
+            <w:pPr>
+              <w:rPr>
+                <w:lang w:val="en-US"/>
+              </w:rPr>
+            </w:pPr>
           </w:p>
         </w:tc>
       </w:tr>
@@ -2207,6 +2279,7 @@
               <w:rPr>
                 <w:lang w:val="en-US"/>
               </w:rPr>
+              <w:lastRenderedPageBreak/>
               <w:t>Variable comparison operators</w:t>
             </w:r>
           </w:p>
@@ -2269,6 +2342,7 @@
                 <w:lang w:val="en-US"/>
               </w:rPr>
             </w:pPr>
+            <w:proofErr w:type="spellStart"/>
             <w:r>
               <w:rPr>
                 <w:i/>
@@ -2277,15 +2351,9 @@
                 <w:szCs w:val="20"/>
                 <w:lang w:val="en-US"/>
               </w:rPr>
-              <w:t>file.js</w:t>
-            </w:r>
-          </w:p>
-          <w:p>
-            <w:pPr>
-              <w:rPr>
-                <w:lang w:val="en-US"/>
-              </w:rPr>
-            </w:pPr>
+              <w:t>js</w:t>
+            </w:r>
+            <w:proofErr w:type="spellEnd"/>
             <w:r>
               <w:rPr>
                 <w:i/>
@@ -2294,7 +2362,7 @@
                 <w:szCs w:val="20"/>
                 <w:lang w:val="en-US"/>
               </w:rPr>
-              <w:t>line</w:t>
+              <w:t>/player.js</w:t>
             </w:r>
             <w:r>
               <w:rPr>
@@ -2304,7 +2372,7 @@
                 <w:szCs w:val="20"/>
                 <w:lang w:val="en-US"/>
               </w:rPr>
-              <w:t>: XXX</w:t>
+              <w:t xml:space="preserve"> (l. 5-14)</w:t>
             </w:r>
           </w:p>
         </w:tc>
@@ -2365,11 +2433,43 @@
             </w:pPr>
             <w:r>
               <w:rPr>
-                <w:noProof/>
-                <w:highlight w:val="red"/>
-                <w:lang w:val="en-US"/>
-              </w:rPr>
-              <w:t>Your screenshot</w:t>
+                <w:lang w:val="en-US"/>
+              </w:rPr>
+              <w:drawing>
+                <wp:inline distT="0" distB="0" distL="0" distR="0" wp14:anchorId="0B970B02" wp14:editId="3C8E0FFD">
+                  <wp:extent cx="4629150" cy="1510665"/>
+                  <wp:effectExtent l="0" t="0" r="0" b="0"/>
+                  <wp:docPr id="1644296453" name="Image 1"/>
+                  <wp:cNvGraphicFramePr>
+                    <a:graphicFrameLocks xmlns:a="http://schemas.openxmlformats.org/drawingml/2006/main" noChangeAspect="1"/>
+                  </wp:cNvGraphicFramePr>
+                  <a:graphic xmlns:a="http://schemas.openxmlformats.org/drawingml/2006/main">
+                    <a:graphicData uri="http://schemas.openxmlformats.org/drawingml/2006/picture">
+                      <pic:pic xmlns:pic="http://schemas.openxmlformats.org/drawingml/2006/picture">
+                        <pic:nvPicPr>
+                          <pic:cNvPr id="1644296453" name=""/>
+                          <pic:cNvPicPr/>
+                        </pic:nvPicPr>
+                        <pic:blipFill>
+                          <a:blip r:embed="rId21"/>
+                          <a:stretch>
+                            <a:fillRect/>
+                          </a:stretch>
+                        </pic:blipFill>
+                        <pic:spPr>
+                          <a:xfrm>
+                            <a:off x="0" y="0"/>
+                            <a:ext cx="4629150" cy="1510665"/>
+                          </a:xfrm>
+                          <a:prstGeom prst="rect">
+                            <a:avLst/>
+                          </a:prstGeom>
+                        </pic:spPr>
+                      </pic:pic>
+                    </a:graphicData>
+                  </a:graphic>
+                </wp:inline>
+              </w:drawing>
             </w:r>
           </w:p>
         </w:tc>
@@ -2409,7 +2509,6 @@
               <w:rPr>
                 <w:lang w:val="en-US"/>
               </w:rPr>
-              <w:lastRenderedPageBreak/>
               <w:t>Loop &amp; iterators</w:t>
             </w:r>
           </w:p>
@@ -2475,43 +2574,16 @@
             </w:tcMar>
           </w:tcPr>
           <w:p>
-            <w:pPr>
-              <w:rPr>
-                <w:lang w:val="en-US"/>
-              </w:rPr>
-            </w:pPr>
-            <w:r>
-              <w:rPr>
-                <w:lang w:val="en-US"/>
-              </w:rPr>
-              <w:t>snake.js</w:t>
-            </w:r>
-          </w:p>
-          <w:p>
-            <w:pPr>
-              <w:rPr>
-                <w:lang w:val="en-US"/>
-              </w:rPr>
-            </w:pPr>
-            <w:proofErr w:type="gramStart"/>
-            <w:r>
-              <w:rPr>
-                <w:lang w:val="en-US"/>
-              </w:rPr>
-              <w:t>line</w:t>
-            </w:r>
-            <w:r>
-              <w:rPr>
-                <w:lang w:val="en-US"/>
-              </w:rPr>
-              <w:t xml:space="preserve"> :</w:t>
-            </w:r>
-            <w:proofErr w:type="gramEnd"/>
-            <w:r>
-              <w:rPr>
-                <w:lang w:val="en-US"/>
-              </w:rPr>
-              <w:t xml:space="preserve"> 411</w:t>
+            <w:proofErr w:type="spellStart"/>
+            <w:r>
+              <w:t>js</w:t>
+            </w:r>
+            <w:proofErr w:type="spellEnd"/>
+            <w:r>
+              <w:t>/projectile.js</w:t>
+            </w:r>
+            <w:r>
+              <w:t xml:space="preserve"> (l.72-82)</w:t>
             </w:r>
           </w:p>
         </w:tc>
@@ -2575,11 +2647,43 @@
             </w:pPr>
             <w:r>
               <w:rPr>
-                <w:noProof/>
-                <w:highlight w:val="red"/>
-                <w:lang w:val="en-US"/>
-              </w:rPr>
-              <w:t>Your screenshot</w:t>
+                <w:lang w:val="en-US"/>
+              </w:rPr>
+              <w:drawing>
+                <wp:inline distT="0" distB="0" distL="0" distR="0" wp14:anchorId="4918F284" wp14:editId="5D1C85F2">
+                  <wp:extent cx="4629150" cy="1936115"/>
+                  <wp:effectExtent l="0" t="0" r="0" b="6985"/>
+                  <wp:docPr id="1234383311" name="Image 1"/>
+                  <wp:cNvGraphicFramePr>
+                    <a:graphicFrameLocks xmlns:a="http://schemas.openxmlformats.org/drawingml/2006/main" noChangeAspect="1"/>
+                  </wp:cNvGraphicFramePr>
+                  <a:graphic xmlns:a="http://schemas.openxmlformats.org/drawingml/2006/main">
+                    <a:graphicData uri="http://schemas.openxmlformats.org/drawingml/2006/picture">
+                      <pic:pic xmlns:pic="http://schemas.openxmlformats.org/drawingml/2006/picture">
+                        <pic:nvPicPr>
+                          <pic:cNvPr id="1234383311" name=""/>
+                          <pic:cNvPicPr/>
+                        </pic:nvPicPr>
+                        <pic:blipFill>
+                          <a:blip r:embed="rId22"/>
+                          <a:stretch>
+                            <a:fillRect/>
+                          </a:stretch>
+                        </pic:blipFill>
+                        <pic:spPr>
+                          <a:xfrm>
+                            <a:off x="0" y="0"/>
+                            <a:ext cx="4629150" cy="1936115"/>
+                          </a:xfrm>
+                          <a:prstGeom prst="rect">
+                            <a:avLst/>
+                          </a:prstGeom>
+                        </pic:spPr>
+                      </pic:pic>
+                    </a:graphicData>
+                  </a:graphic>
+                </wp:inline>
+              </w:drawing>
             </w:r>
           </w:p>
         </w:tc>
@@ -2719,6 +2823,7 @@
                 <w:lang w:val="en-US"/>
               </w:rPr>
             </w:pPr>
+            <w:proofErr w:type="spellStart"/>
             <w:r>
               <w:rPr>
                 <w:i/>
@@ -2727,15 +2832,9 @@
                 <w:szCs w:val="20"/>
                 <w:lang w:val="en-US"/>
               </w:rPr>
-              <w:t>file.js</w:t>
-            </w:r>
-          </w:p>
-          <w:p>
-            <w:pPr>
-              <w:rPr>
-                <w:lang w:val="en-US"/>
-              </w:rPr>
-            </w:pPr>
+              <w:t>js</w:t>
+            </w:r>
+            <w:proofErr w:type="spellEnd"/>
             <w:r>
               <w:rPr>
                 <w:i/>
@@ -2744,7 +2843,7 @@
                 <w:szCs w:val="20"/>
                 <w:lang w:val="en-US"/>
               </w:rPr>
-              <w:t>line</w:t>
+              <w:t>/enemy.js</w:t>
             </w:r>
             <w:r>
               <w:rPr>
@@ -2754,7 +2853,50 @@
                 <w:szCs w:val="20"/>
                 <w:lang w:val="en-US"/>
               </w:rPr>
-              <w:t>: XXX</w:t>
+              <w:t xml:space="preserve"> (l. 65)</w:t>
+            </w:r>
+          </w:p>
+          <w:p>
+            <w:pPr>
+              <w:rPr>
+                <w:i/>
+                <w:iCs/>
+                <w:sz w:val="20"/>
+                <w:szCs w:val="20"/>
+                <w:lang w:val="en-US"/>
+              </w:rPr>
+            </w:pPr>
+            <w:proofErr w:type="spellStart"/>
+            <w:r>
+              <w:rPr>
+                <w:i/>
+                <w:iCs/>
+                <w:sz w:val="20"/>
+                <w:szCs w:val="20"/>
+                <w:lang w:val="en-US"/>
+              </w:rPr>
+              <w:t>js</w:t>
+            </w:r>
+            <w:proofErr w:type="spellEnd"/>
+            <w:r>
+              <w:rPr>
+                <w:i/>
+                <w:iCs/>
+                <w:sz w:val="20"/>
+                <w:szCs w:val="20"/>
+                <w:lang w:val="en-US"/>
+              </w:rPr>
+              <w:t>/input-handler.js</w:t>
+            </w:r>
+            <w:r>
+              <w:rPr>
+                <w:i/>
+                <w:iCs/>
+                <w:sz w:val="20"/>
+                <w:szCs w:val="20"/>
+                <w:lang w:val="en-US"/>
+              </w:rPr>
+              <w:t xml:space="preserve"> (l.8)</w:t>
             </w:r>
           </w:p>
         </w:tc>
@@ -2815,11 +2957,90 @@
             </w:pPr>
             <w:r>
               <w:rPr>
-                <w:noProof/>
-                <w:highlight w:val="red"/>
-                <w:lang w:val="en-US"/>
-              </w:rPr>
-              <w:t>Your screenshot</w:t>
+                <w:lang w:val="en-US"/>
+              </w:rPr>
+              <w:drawing>
+                <wp:inline distT="0" distB="0" distL="0" distR="0" wp14:anchorId="2237B3F3" wp14:editId="4DFF44AC">
+                  <wp:extent cx="3017782" cy="160034"/>
+                  <wp:effectExtent l="0" t="0" r="0" b="0"/>
+                  <wp:docPr id="33092054" name="Image 1"/>
+                  <wp:cNvGraphicFramePr>
+                    <a:graphicFrameLocks xmlns:a="http://schemas.openxmlformats.org/drawingml/2006/main" noChangeAspect="1"/>
+                  </wp:cNvGraphicFramePr>
+                  <a:graphic xmlns:a="http://schemas.openxmlformats.org/drawingml/2006/main">
+                    <a:graphicData uri="http://schemas.openxmlformats.org/drawingml/2006/picture">
+                      <pic:pic xmlns:pic="http://schemas.openxmlformats.org/drawingml/2006/picture">
+                        <pic:nvPicPr>
+                          <pic:cNvPr id="33092054" name=""/>
+                          <pic:cNvPicPr/>
+                        </pic:nvPicPr>
+                        <pic:blipFill>
+                          <a:blip r:embed="rId23"/>
+                          <a:stretch>
+                            <a:fillRect/>
+                          </a:stretch>
+                        </pic:blipFill>
+                        <pic:spPr>
+                          <a:xfrm>
+                            <a:off x="0" y="0"/>
+                            <a:ext cx="3017782" cy="160034"/>
+                          </a:xfrm>
+                          <a:prstGeom prst="rect">
+                            <a:avLst/>
+                          </a:prstGeom>
+                        </pic:spPr>
+                      </pic:pic>
+                    </a:graphicData>
+                  </a:graphic>
+                </wp:inline>
+              </w:drawing>
+            </w:r>
+          </w:p>
+          <w:p>
+            <w:pPr>
+              <w:rPr>
+                <w:lang w:val="en-US"/>
+              </w:rPr>
+            </w:pPr>
+            <w:r>
+              <w:rPr>
+                <w:lang w:val="en-US"/>
+              </w:rPr>
+              <w:drawing>
+                <wp:inline distT="0" distB="0" distL="0" distR="0" wp14:anchorId="0A318FC7" wp14:editId="2A656E81">
+                  <wp:extent cx="3939881" cy="175275"/>
+                  <wp:effectExtent l="0" t="0" r="3810" b="0"/>
+                  <wp:docPr id="1706042139" name="Image 1"/>
+                  <wp:cNvGraphicFramePr>
+                    <a:graphicFrameLocks xmlns:a="http://schemas.openxmlformats.org/drawingml/2006/main" noChangeAspect="1"/>
+                  </wp:cNvGraphicFramePr>
+                  <a:graphic xmlns:a="http://schemas.openxmlformats.org/drawingml/2006/main">
+                    <a:graphicData uri="http://schemas.openxmlformats.org/drawingml/2006/picture">
+                      <pic:pic xmlns:pic="http://schemas.openxmlformats.org/drawingml/2006/picture">
+                        <pic:nvPicPr>
+                          <pic:cNvPr id="1706042139" name=""/>
+                          <pic:cNvPicPr/>
+                        </pic:nvPicPr>
+                        <pic:blipFill>
+                          <a:blip r:embed="rId24"/>
+                          <a:stretch>
+                            <a:fillRect/>
+                          </a:stretch>
+                        </pic:blipFill>
+                        <pic:spPr>
+                          <a:xfrm>
+                            <a:off x="0" y="0"/>
+                            <a:ext cx="3939881" cy="175275"/>
+                          </a:xfrm>
+                          <a:prstGeom prst="rect">
+                            <a:avLst/>
+                          </a:prstGeom>
+                        </pic:spPr>
+                      </pic:pic>
+                    </a:graphicData>
+                  </a:graphic>
+                </wp:inline>
+              </w:drawing>
             </w:r>
           </w:p>
         </w:tc>
@@ -2921,6 +3142,7 @@
                 <w:lang w:val="en-US"/>
               </w:rPr>
             </w:pPr>
+            <w:proofErr w:type="spellStart"/>
             <w:r>
               <w:rPr>
                 <w:i/>
@@ -2929,15 +3151,9 @@
                 <w:szCs w:val="20"/>
                 <w:lang w:val="en-US"/>
               </w:rPr>
-              <w:t>file.js</w:t>
-            </w:r>
-          </w:p>
-          <w:p>
-            <w:pPr>
-              <w:rPr>
-                <w:lang w:val="en-US"/>
-              </w:rPr>
-            </w:pPr>
+              <w:t>js</w:t>
+            </w:r>
+            <w:proofErr w:type="spellEnd"/>
             <w:r>
               <w:rPr>
                 <w:i/>
@@ -2946,7 +3162,7 @@
                 <w:szCs w:val="20"/>
                 <w:lang w:val="en-US"/>
               </w:rPr>
-              <w:t>line</w:t>
+              <w:t>/setup.js</w:t>
             </w:r>
             <w:r>
               <w:rPr>
@@ -2956,7 +3172,36 @@
                 <w:szCs w:val="20"/>
                 <w:lang w:val="en-US"/>
               </w:rPr>
-              <w:t>: XXX</w:t>
+              <w:t xml:space="preserve"> (l. 63)</w:t>
+            </w:r>
+          </w:p>
+          <w:p>
+            <w:pPr>
+              <w:rPr>
+                <w:lang w:val="en-US"/>
+              </w:rPr>
+            </w:pPr>
+            <w:proofErr w:type="spellStart"/>
+            <w:r>
+              <w:rPr>
+                <w:i/>
+                <w:iCs/>
+                <w:sz w:val="20"/>
+                <w:szCs w:val="20"/>
+                <w:lang w:val="en-US"/>
+              </w:rPr>
+              <w:t>js</w:t>
+            </w:r>
+            <w:proofErr w:type="spellEnd"/>
+            <w:r>
+              <w:rPr>
+                <w:i/>
+                <w:iCs/>
+                <w:sz w:val="20"/>
+                <w:szCs w:val="20"/>
+                <w:lang w:val="en-US"/>
+              </w:rPr>
+              <w:t>/player.js (l.64-74)</w:t>
             </w:r>
           </w:p>
         </w:tc>
@@ -3020,11 +3265,91 @@
             </w:pPr>
             <w:r>
               <w:rPr>
-                <w:noProof/>
-                <w:highlight w:val="red"/>
-                <w:lang w:val="en-US"/>
-              </w:rPr>
-              <w:t>Your screenshot</w:t>
+                <w:lang w:val="en-US"/>
+              </w:rPr>
+              <w:drawing>
+                <wp:inline distT="0" distB="0" distL="0" distR="0" wp14:anchorId="6CCA5B80" wp14:editId="2A253995">
+                  <wp:extent cx="4629150" cy="152400"/>
+                  <wp:effectExtent l="0" t="0" r="0" b="0"/>
+                  <wp:docPr id="397650798" name="Image 1"/>
+                  <wp:cNvGraphicFramePr>
+                    <a:graphicFrameLocks xmlns:a="http://schemas.openxmlformats.org/drawingml/2006/main" noChangeAspect="1"/>
+                  </wp:cNvGraphicFramePr>
+                  <a:graphic xmlns:a="http://schemas.openxmlformats.org/drawingml/2006/main">
+                    <a:graphicData uri="http://schemas.openxmlformats.org/drawingml/2006/picture">
+                      <pic:pic xmlns:pic="http://schemas.openxmlformats.org/drawingml/2006/picture">
+                        <pic:nvPicPr>
+                          <pic:cNvPr id="397650798" name=""/>
+                          <pic:cNvPicPr/>
+                        </pic:nvPicPr>
+                        <pic:blipFill>
+                          <a:blip r:embed="rId25"/>
+                          <a:stretch>
+                            <a:fillRect/>
+                          </a:stretch>
+                        </pic:blipFill>
+                        <pic:spPr>
+                          <a:xfrm>
+                            <a:off x="0" y="0"/>
+                            <a:ext cx="4629150" cy="152400"/>
+                          </a:xfrm>
+                          <a:prstGeom prst="rect">
+                            <a:avLst/>
+                          </a:prstGeom>
+                        </pic:spPr>
+                      </pic:pic>
+                    </a:graphicData>
+                  </a:graphic>
+                </wp:inline>
+              </w:drawing>
+            </w:r>
+          </w:p>
+          <w:p>
+            <w:pPr>
+              <w:rPr>
+                <w:lang w:val="en-US"/>
+              </w:rPr>
+            </w:pPr>
+            <w:r>
+              <w:rPr>
+                <w:lang w:val="en-US"/>
+              </w:rPr>
+              <w:lastRenderedPageBreak/>
+              <w:drawing>
+                <wp:inline distT="0" distB="0" distL="0" distR="0" wp14:anchorId="62E04D62" wp14:editId="5205830A">
+                  <wp:extent cx="4629150" cy="1207770"/>
+                  <wp:effectExtent l="0" t="0" r="0" b="0"/>
+                  <wp:docPr id="696494182" name="Image 1"/>
+                  <wp:cNvGraphicFramePr>
+                    <a:graphicFrameLocks xmlns:a="http://schemas.openxmlformats.org/drawingml/2006/main" noChangeAspect="1"/>
+                  </wp:cNvGraphicFramePr>
+                  <a:graphic xmlns:a="http://schemas.openxmlformats.org/drawingml/2006/main">
+                    <a:graphicData uri="http://schemas.openxmlformats.org/drawingml/2006/picture">
+                      <pic:pic xmlns:pic="http://schemas.openxmlformats.org/drawingml/2006/picture">
+                        <pic:nvPicPr>
+                          <pic:cNvPr id="696494182" name=""/>
+                          <pic:cNvPicPr/>
+                        </pic:nvPicPr>
+                        <pic:blipFill>
+                          <a:blip r:embed="rId26"/>
+                          <a:stretch>
+                            <a:fillRect/>
+                          </a:stretch>
+                        </pic:blipFill>
+                        <pic:spPr>
+                          <a:xfrm>
+                            <a:off x="0" y="0"/>
+                            <a:ext cx="4629150" cy="1207770"/>
+                          </a:xfrm>
+                          <a:prstGeom prst="rect">
+                            <a:avLst/>
+                          </a:prstGeom>
+                        </pic:spPr>
+                      </pic:pic>
+                    </a:graphicData>
+                  </a:graphic>
+                </wp:inline>
+              </w:drawing>
             </w:r>
           </w:p>
         </w:tc>
@@ -3064,6 +3389,7 @@
               <w:rPr>
                 <w:lang w:val="en-US"/>
               </w:rPr>
+              <w:lastRenderedPageBreak/>
               <w:t>Callback</w:t>
             </w:r>
           </w:p>
@@ -3119,13 +3445,23 @@
           <w:p>
             <w:pPr>
               <w:rPr>
+                <w:sz w:val="20"/>
+                <w:szCs w:val="20"/>
+                <w:lang w:val="en-US"/>
+              </w:rPr>
+            </w:pPr>
+            <w:proofErr w:type="spellStart"/>
+            <w:r>
+              <w:rPr>
                 <w:i/>
                 <w:iCs/>
                 <w:sz w:val="20"/>
                 <w:szCs w:val="20"/>
                 <w:lang w:val="en-US"/>
               </w:rPr>
-            </w:pPr>
+              <w:t>js</w:t>
+            </w:r>
+            <w:proofErr w:type="spellEnd"/>
             <w:r>
               <w:rPr>
                 <w:i/>
@@ -3134,36 +3470,7 @@
                 <w:szCs w:val="20"/>
                 <w:lang w:val="en-US"/>
               </w:rPr>
-              <w:t>file.js</w:t>
-            </w:r>
-          </w:p>
-          <w:p>
-            <w:pPr>
-              <w:rPr>
-                <w:sz w:val="20"/>
-                <w:szCs w:val="20"/>
-                <w:lang w:val="en-US"/>
-              </w:rPr>
-            </w:pPr>
-            <w:r>
-              <w:rPr>
-                <w:i/>
-                <w:iCs/>
-                <w:sz w:val="20"/>
-                <w:szCs w:val="20"/>
-                <w:lang w:val="en-US"/>
-              </w:rPr>
-              <w:t>line</w:t>
-            </w:r>
-            <w:r>
-              <w:rPr>
-                <w:i/>
-                <w:iCs/>
-                <w:sz w:val="20"/>
-                <w:szCs w:val="20"/>
-                <w:lang w:val="en-US"/>
-              </w:rPr>
-              <w:t>: XXX</w:t>
+              <w:t>/game.js (l. 330)</w:t>
             </w:r>
           </w:p>
         </w:tc>
@@ -3228,11 +3535,43 @@
             </w:pPr>
             <w:r>
               <w:rPr>
-                <w:noProof/>
-                <w:highlight w:val="red"/>
-                <w:lang w:val="en-US"/>
-              </w:rPr>
-              <w:t>Your screenshot</w:t>
+                <w:lang w:val="en-US"/>
+              </w:rPr>
+              <w:drawing>
+                <wp:inline distT="0" distB="0" distL="0" distR="0" wp14:anchorId="3729EA96" wp14:editId="5E194CBD">
+                  <wp:extent cx="3215919" cy="198137"/>
+                  <wp:effectExtent l="0" t="0" r="3810" b="0"/>
+                  <wp:docPr id="1493050093" name="Image 1"/>
+                  <wp:cNvGraphicFramePr>
+                    <a:graphicFrameLocks xmlns:a="http://schemas.openxmlformats.org/drawingml/2006/main" noChangeAspect="1"/>
+                  </wp:cNvGraphicFramePr>
+                  <a:graphic xmlns:a="http://schemas.openxmlformats.org/drawingml/2006/main">
+                    <a:graphicData uri="http://schemas.openxmlformats.org/drawingml/2006/picture">
+                      <pic:pic xmlns:pic="http://schemas.openxmlformats.org/drawingml/2006/picture">
+                        <pic:nvPicPr>
+                          <pic:cNvPr id="1493050093" name=""/>
+                          <pic:cNvPicPr/>
+                        </pic:nvPicPr>
+                        <pic:blipFill>
+                          <a:blip r:embed="rId27"/>
+                          <a:stretch>
+                            <a:fillRect/>
+                          </a:stretch>
+                        </pic:blipFill>
+                        <pic:spPr>
+                          <a:xfrm>
+                            <a:off x="0" y="0"/>
+                            <a:ext cx="3215919" cy="198137"/>
+                          </a:xfrm>
+                          <a:prstGeom prst="rect">
+                            <a:avLst/>
+                          </a:prstGeom>
+                        </pic:spPr>
+                      </pic:pic>
+                    </a:graphicData>
+                  </a:graphic>
+                </wp:inline>
+              </w:drawing>
             </w:r>
           </w:p>
         </w:tc>
@@ -3335,51 +3674,55 @@
           <w:p>
             <w:pPr>
               <w:rPr>
-                <w:i/>
-                <w:iCs/>
-                <w:sz w:val="20"/>
-                <w:szCs w:val="20"/>
-                <w:lang w:val="en-US"/>
-              </w:rPr>
-            </w:pPr>
-            <w:r>
-              <w:rPr>
-                <w:i/>
-                <w:iCs/>
-                <w:sz w:val="20"/>
-                <w:szCs w:val="20"/>
-                <w:lang w:val="en-US"/>
-              </w:rPr>
-              <w:t>file.js</w:t>
-            </w:r>
-          </w:p>
-          <w:p>
-            <w:pPr>
-              <w:rPr>
-                <w:sz w:val="20"/>
-                <w:szCs w:val="20"/>
-                <w:lang w:val="en-US"/>
-              </w:rPr>
-            </w:pPr>
-            <w:r>
-              <w:rPr>
-                <w:i/>
-                <w:iCs/>
-                <w:sz w:val="20"/>
-                <w:szCs w:val="20"/>
-                <w:lang w:val="en-US"/>
-              </w:rPr>
-              <w:t>line</w:t>
-            </w:r>
-            <w:r>
-              <w:rPr>
-                <w:i/>
-                <w:iCs/>
-                <w:sz w:val="20"/>
-                <w:szCs w:val="20"/>
-                <w:lang w:val="en-US"/>
-              </w:rPr>
-              <w:t>: XXX</w:t>
+                <w:sz w:val="20"/>
+                <w:szCs w:val="20"/>
+              </w:rPr>
+            </w:pPr>
+            <w:r>
+              <w:rPr>
+                <w:sz w:val="20"/>
+                <w:szCs w:val="20"/>
+              </w:rPr>
+              <w:t>index.html</w:t>
+            </w:r>
+            <w:r>
+              <w:rPr>
+                <w:sz w:val="20"/>
+                <w:szCs w:val="20"/>
+              </w:rPr>
+              <w:t xml:space="preserve"> (l.52-67)</w:t>
+            </w:r>
+          </w:p>
+          <w:p>
+            <w:pPr>
+              <w:rPr>
+                <w:sz w:val="20"/>
+                <w:szCs w:val="20"/>
+                <w:lang w:val="en-US"/>
+              </w:rPr>
+            </w:pPr>
+            <w:proofErr w:type="spellStart"/>
+            <w:r>
+              <w:rPr>
+                <w:sz w:val="20"/>
+                <w:szCs w:val="20"/>
+              </w:rPr>
+              <w:t>js</w:t>
+            </w:r>
+            <w:proofErr w:type="spellEnd"/>
+            <w:r>
+              <w:rPr>
+                <w:sz w:val="20"/>
+                <w:szCs w:val="20"/>
+              </w:rPr>
+              <w:t>/setup.js</w:t>
+            </w:r>
+            <w:r>
+              <w:rPr>
+                <w:sz w:val="20"/>
+                <w:szCs w:val="20"/>
+              </w:rPr>
+              <w:t xml:space="preserve"> (l.31-34)</w:t>
             </w:r>
           </w:p>
         </w:tc>
@@ -3443,225 +3786,90 @@
             </w:pPr>
             <w:r>
               <w:rPr>
-                <w:noProof/>
-                <w:highlight w:val="red"/>
-                <w:lang w:val="en-US"/>
-              </w:rPr>
-              <w:t>Your screenshot</w:t>
-            </w:r>
-          </w:p>
-        </w:tc>
-      </w:tr>
-      <w:tr>
-        <w:tblPrEx>
-          <w:tblLook w:val="0600" w:firstRow="0" w:lastRow="0" w:firstColumn="0" w:lastColumn="0" w:noHBand="1" w:noVBand="1"/>
-        </w:tblPrEx>
-        <w:trPr>
-          <w:trHeight w:val="500"/>
-        </w:trPr>
-        <w:tc>
-          <w:tcPr>
-            <w:tcW w:w="1555" w:type="dxa"/>
-            <w:vMerge w:val="restart"/>
-            <w:tcBorders>
-              <w:top w:val="single" w:sz="4" w:space="0" w:color="000000" w:themeColor="text1"/>
-              <w:left w:val="single" w:sz="4" w:space="0" w:color="000000" w:themeColor="text1"/>
-              <w:bottom w:val="single" w:sz="4" w:space="0" w:color="000000" w:themeColor="text1"/>
-              <w:right w:val="single" w:sz="4" w:space="0" w:color="000000" w:themeColor="text1"/>
-            </w:tcBorders>
-            <w:shd w:val="clear" w:color="auto" w:fill="DCE6F1"/>
-            <w:tcMar>
-              <w:top w:w="100" w:type="dxa"/>
-              <w:left w:w="100" w:type="dxa"/>
-              <w:bottom w:w="100" w:type="dxa"/>
-              <w:right w:w="100" w:type="dxa"/>
-            </w:tcMar>
-          </w:tcPr>
-          <w:p>
-            <w:pPr>
-              <w:rPr>
-                <w:lang w:val="en-US"/>
-              </w:rPr>
-            </w:pPr>
-            <w:r>
-              <w:rPr>
-                <w:lang w:val="en-US"/>
-              </w:rPr>
-              <w:t>Ajax</w:t>
-            </w:r>
-          </w:p>
-        </w:tc>
-        <w:tc>
-          <w:tcPr>
-            <w:tcW w:w="4970" w:type="dxa"/>
-            <w:tcBorders>
-              <w:top w:val="single" w:sz="4" w:space="0" w:color="000000" w:themeColor="text1"/>
-              <w:left w:val="single" w:sz="4" w:space="0" w:color="000000" w:themeColor="text1"/>
-              <w:bottom w:val="single" w:sz="4" w:space="0" w:color="000000" w:themeColor="text1"/>
-              <w:right w:val="single" w:sz="4" w:space="0" w:color="000000" w:themeColor="text1"/>
-            </w:tcBorders>
-            <w:shd w:val="clear" w:color="auto" w:fill="DCE6F1"/>
-            <w:tcMar>
-              <w:top w:w="100" w:type="dxa"/>
-              <w:left w:w="100" w:type="dxa"/>
-              <w:bottom w:w="100" w:type="dxa"/>
-              <w:right w:w="100" w:type="dxa"/>
-            </w:tcMar>
-          </w:tcPr>
-          <w:p>
-            <w:pPr>
-              <w:rPr>
-                <w:lang w:val="en-US"/>
-              </w:rPr>
-            </w:pPr>
-            <w:r>
-              <w:rPr>
-                <w:lang w:val="en-US"/>
-              </w:rPr>
-              <w:t>OPTIONAL</w:t>
-            </w:r>
-            <w:r>
-              <w:rPr>
-                <w:lang w:val="en-US"/>
-              </w:rPr>
-              <w:br/>
-              <w:t>(Game setup)</w:t>
-            </w:r>
-          </w:p>
-        </w:tc>
-        <w:tc>
-          <w:tcPr>
-            <w:tcW w:w="2520" w:type="dxa"/>
-            <w:tcBorders>
-              <w:top w:val="single" w:sz="4" w:space="0" w:color="000000" w:themeColor="text1"/>
-              <w:left w:val="single" w:sz="4" w:space="0" w:color="000000" w:themeColor="text1"/>
-              <w:bottom w:val="single" w:sz="4" w:space="0" w:color="000000" w:themeColor="text1"/>
-              <w:right w:val="single" w:sz="4" w:space="0" w:color="000000" w:themeColor="text1"/>
-            </w:tcBorders>
-            <w:shd w:val="clear" w:color="auto" w:fill="DCE6F1"/>
-            <w:tcMar>
-              <w:top w:w="100" w:type="dxa"/>
-              <w:left w:w="100" w:type="dxa"/>
-              <w:bottom w:w="100" w:type="dxa"/>
-              <w:right w:w="100" w:type="dxa"/>
-            </w:tcMar>
-          </w:tcPr>
-          <w:p>
-            <w:pPr>
-              <w:rPr>
-                <w:i/>
-                <w:iCs/>
-                <w:sz w:val="20"/>
-                <w:szCs w:val="20"/>
-                <w:lang w:val="en-US"/>
-              </w:rPr>
-            </w:pPr>
-            <w:r>
-              <w:rPr>
-                <w:i/>
-                <w:iCs/>
-                <w:sz w:val="20"/>
-                <w:szCs w:val="20"/>
-                <w:lang w:val="en-US"/>
-              </w:rPr>
-              <w:t>file.js</w:t>
-            </w:r>
-          </w:p>
-          <w:p>
-            <w:pPr>
-              <w:rPr>
-                <w:sz w:val="20"/>
-                <w:szCs w:val="20"/>
-                <w:lang w:val="en-US"/>
-              </w:rPr>
-            </w:pPr>
-            <w:r>
-              <w:rPr>
-                <w:i/>
-                <w:iCs/>
-                <w:sz w:val="20"/>
-                <w:szCs w:val="20"/>
-                <w:lang w:val="en-US"/>
-              </w:rPr>
-              <w:t>line</w:t>
-            </w:r>
-            <w:r>
-              <w:rPr>
-                <w:i/>
-                <w:iCs/>
-                <w:sz w:val="20"/>
-                <w:szCs w:val="20"/>
-                <w:lang w:val="en-US"/>
-              </w:rPr>
-              <w:t>: XXX</w:t>
-            </w:r>
-          </w:p>
-        </w:tc>
-      </w:tr>
-      <w:tr>
-        <w:tblPrEx>
-          <w:tblLook w:val="0600" w:firstRow="0" w:lastRow="0" w:firstColumn="0" w:lastColumn="0" w:noHBand="1" w:noVBand="1"/>
-        </w:tblPrEx>
-        <w:trPr>
-          <w:trHeight w:val="500"/>
-        </w:trPr>
-        <w:tc>
-          <w:tcPr>
-            <w:tcW w:w="1555" w:type="dxa"/>
-            <w:vMerge/>
-            <w:tcBorders>
-              <w:top w:val="single" w:sz="4" w:space="0" w:color="000000" w:themeColor="text1"/>
-              <w:left w:val="single" w:sz="4" w:space="0" w:color="000000" w:themeColor="text1"/>
-              <w:bottom w:val="single" w:sz="4" w:space="0" w:color="000000" w:themeColor="text1"/>
-              <w:right w:val="single" w:sz="4" w:space="0" w:color="000000" w:themeColor="text1"/>
-            </w:tcBorders>
-            <w:shd w:val="clear" w:color="auto" w:fill="DCE6F1"/>
-            <w:tcMar>
-              <w:top w:w="100" w:type="dxa"/>
-              <w:left w:w="100" w:type="dxa"/>
-              <w:bottom w:w="100" w:type="dxa"/>
-              <w:right w:w="100" w:type="dxa"/>
-            </w:tcMar>
-          </w:tcPr>
-          <w:p>
-            <w:pPr>
-              <w:rPr>
-                <w:lang w:val="en-US"/>
-              </w:rPr>
-            </w:pPr>
-          </w:p>
-        </w:tc>
-        <w:tc>
-          <w:tcPr>
-            <w:tcW w:w="7490" w:type="dxa"/>
-            <w:gridSpan w:val="2"/>
-            <w:tcBorders>
-              <w:top w:val="single" w:sz="4" w:space="0" w:color="000000" w:themeColor="text1"/>
-              <w:left w:val="single" w:sz="4" w:space="0" w:color="000000" w:themeColor="text1"/>
-              <w:bottom w:val="single" w:sz="4" w:space="0" w:color="000000" w:themeColor="text1"/>
-              <w:right w:val="single" w:sz="4" w:space="0" w:color="000000" w:themeColor="text1"/>
-            </w:tcBorders>
-            <w:shd w:val="clear" w:color="auto" w:fill="DCE6F1"/>
-            <w:tcMar>
-              <w:top w:w="100" w:type="dxa"/>
-              <w:left w:w="100" w:type="dxa"/>
-              <w:bottom w:w="100" w:type="dxa"/>
-              <w:right w:w="100" w:type="dxa"/>
-            </w:tcMar>
-          </w:tcPr>
-          <w:p>
-            <w:pPr>
-              <w:rPr>
-                <w:lang w:val="en-US"/>
-              </w:rPr>
-            </w:pPr>
-            <w:r>
-              <w:rPr>
-                <w:noProof/>
-                <w:highlight w:val="red"/>
-                <w:lang w:val="en-US"/>
-              </w:rPr>
-              <w:t>Your screenshot</w:t>
+                <w:lang w:val="en-US"/>
+              </w:rPr>
+              <w:drawing>
+                <wp:inline distT="0" distB="0" distL="0" distR="0" wp14:anchorId="7F0E556C" wp14:editId="63F00831">
+                  <wp:extent cx="4629150" cy="202565"/>
+                  <wp:effectExtent l="0" t="0" r="0" b="6985"/>
+                  <wp:docPr id="603873223" name="Image 1"/>
+                  <wp:cNvGraphicFramePr>
+                    <a:graphicFrameLocks xmlns:a="http://schemas.openxmlformats.org/drawingml/2006/main" noChangeAspect="1"/>
+                  </wp:cNvGraphicFramePr>
+                  <a:graphic xmlns:a="http://schemas.openxmlformats.org/drawingml/2006/main">
+                    <a:graphicData uri="http://schemas.openxmlformats.org/drawingml/2006/picture">
+                      <pic:pic xmlns:pic="http://schemas.openxmlformats.org/drawingml/2006/picture">
+                        <pic:nvPicPr>
+                          <pic:cNvPr id="603873223" name=""/>
+                          <pic:cNvPicPr/>
+                        </pic:nvPicPr>
+                        <pic:blipFill>
+                          <a:blip r:embed="rId28"/>
+                          <a:stretch>
+                            <a:fillRect/>
+                          </a:stretch>
+                        </pic:blipFill>
+                        <pic:spPr>
+                          <a:xfrm>
+                            <a:off x="0" y="0"/>
+                            <a:ext cx="4629150" cy="202565"/>
+                          </a:xfrm>
+                          <a:prstGeom prst="rect">
+                            <a:avLst/>
+                          </a:prstGeom>
+                        </pic:spPr>
+                      </pic:pic>
+                    </a:graphicData>
+                  </a:graphic>
+                </wp:inline>
+              </w:drawing>
+            </w:r>
+          </w:p>
+          <w:p>
+            <w:pPr>
+              <w:rPr>
+                <w:lang w:val="en-US"/>
+              </w:rPr>
+            </w:pPr>
+            <w:r>
+              <w:rPr>
+                <w:lang w:val="en-US"/>
+              </w:rPr>
+              <w:drawing>
+                <wp:inline distT="0" distB="0" distL="0" distR="0" wp14:anchorId="309DDF4B" wp14:editId="338C2001">
+                  <wp:extent cx="4629150" cy="523875"/>
+                  <wp:effectExtent l="0" t="0" r="0" b="9525"/>
+                  <wp:docPr id="606573096" name="Image 1"/>
+                  <wp:cNvGraphicFramePr>
+                    <a:graphicFrameLocks xmlns:a="http://schemas.openxmlformats.org/drawingml/2006/main" noChangeAspect="1"/>
+                  </wp:cNvGraphicFramePr>
+                  <a:graphic xmlns:a="http://schemas.openxmlformats.org/drawingml/2006/main">
+                    <a:graphicData uri="http://schemas.openxmlformats.org/drawingml/2006/picture">
+                      <pic:pic xmlns:pic="http://schemas.openxmlformats.org/drawingml/2006/picture">
+                        <pic:nvPicPr>
+                          <pic:cNvPr id="606573096" name=""/>
+                          <pic:cNvPicPr/>
+                        </pic:nvPicPr>
+                        <pic:blipFill>
+                          <a:blip r:embed="rId29"/>
+                          <a:stretch>
+                            <a:fillRect/>
+                          </a:stretch>
+                        </pic:blipFill>
+                        <pic:spPr>
+                          <a:xfrm>
+                            <a:off x="0" y="0"/>
+                            <a:ext cx="4629150" cy="523875"/>
+                          </a:xfrm>
+                          <a:prstGeom prst="rect">
+                            <a:avLst/>
+                          </a:prstGeom>
+                        </pic:spPr>
+                      </pic:pic>
+                    </a:graphicData>
+                  </a:graphic>
+                </wp:inline>
+              </w:drawing>
             </w:r>
           </w:p>
         </w:tc>
@@ -3767,37 +3975,27 @@
                 <w:iCs/>
                 <w:sz w:val="20"/>
                 <w:szCs w:val="20"/>
-                <w:lang w:val="en-US"/>
-              </w:rPr>
-            </w:pPr>
+              </w:rPr>
+            </w:pPr>
+            <w:proofErr w:type="spellStart"/>
             <w:r>
               <w:rPr>
                 <w:i/>
                 <w:iCs/>
                 <w:sz w:val="20"/>
                 <w:szCs w:val="20"/>
-                <w:lang w:val="en-US"/>
-              </w:rPr>
-              <w:t>file.js</w:t>
-            </w:r>
-          </w:p>
-          <w:p>
-            <w:pPr>
-              <w:rPr>
-                <w:sz w:val="20"/>
-                <w:szCs w:val="20"/>
-                <w:lang w:val="en-US"/>
-              </w:rPr>
-            </w:pPr>
+              </w:rPr>
+              <w:t>js</w:t>
+            </w:r>
+            <w:proofErr w:type="spellEnd"/>
             <w:r>
               <w:rPr>
                 <w:i/>
                 <w:iCs/>
                 <w:sz w:val="20"/>
                 <w:szCs w:val="20"/>
-                <w:lang w:val="en-US"/>
-              </w:rPr>
-              <w:t>line</w:t>
+              </w:rPr>
+              <w:t>/setup.js</w:t>
             </w:r>
             <w:r>
               <w:rPr>
@@ -3805,9 +4003,40 @@
                 <w:iCs/>
                 <w:sz w:val="20"/>
                 <w:szCs w:val="20"/>
-                <w:lang w:val="en-US"/>
-              </w:rPr>
-              <w:t>: XXX</w:t>
+              </w:rPr>
+              <w:t xml:space="preserve"> (l. 63)</w:t>
+            </w:r>
+          </w:p>
+          <w:p>
+            <w:pPr>
+              <w:rPr>
+                <w:sz w:val="20"/>
+                <w:szCs w:val="20"/>
+                <w:lang w:val="en-US"/>
+              </w:rPr>
+            </w:pPr>
+            <w:proofErr w:type="spellStart"/>
+            <w:r>
+              <w:rPr>
+                <w:sz w:val="20"/>
+                <w:szCs w:val="20"/>
+              </w:rPr>
+              <w:t>js</w:t>
+            </w:r>
+            <w:proofErr w:type="spellEnd"/>
+            <w:r>
+              <w:rPr>
+                <w:sz w:val="20"/>
+                <w:szCs w:val="20"/>
+              </w:rPr>
+              <w:t>/player.js</w:t>
+            </w:r>
+            <w:r>
+              <w:rPr>
+                <w:sz w:val="20"/>
+                <w:szCs w:val="20"/>
+              </w:rPr>
+              <w:t xml:space="preserve"> (l. 2)</w:t>
             </w:r>
           </w:p>
         </w:tc>
@@ -3872,211 +4101,90 @@
             <w:r>
               <w:rPr>
                 <w:noProof/>
-                <w:highlight w:val="red"/>
-                <w:lang w:val="en-US"/>
-              </w:rPr>
-              <w:t>Your screenshot</w:t>
-            </w:r>
-          </w:p>
-        </w:tc>
-      </w:tr>
-      <w:tr>
-        <w:tblPrEx>
-          <w:tblLook w:val="0600" w:firstRow="0" w:lastRow="0" w:firstColumn="0" w:lastColumn="0" w:noHBand="1" w:noVBand="1"/>
-        </w:tblPrEx>
-        <w:trPr>
-          <w:trHeight w:val="500"/>
-        </w:trPr>
-        <w:tc>
-          <w:tcPr>
-            <w:tcW w:w="1555" w:type="dxa"/>
-            <w:vMerge w:val="restart"/>
-            <w:tcBorders>
-              <w:top w:val="single" w:sz="4" w:space="0" w:color="000000" w:themeColor="text1"/>
-              <w:left w:val="single" w:sz="4" w:space="0" w:color="000000" w:themeColor="text1"/>
-              <w:bottom w:val="single" w:sz="4" w:space="0" w:color="000000" w:themeColor="text1"/>
-              <w:right w:val="single" w:sz="4" w:space="0" w:color="000000" w:themeColor="text1"/>
-            </w:tcBorders>
-            <w:shd w:val="clear" w:color="auto" w:fill="DCE6F1"/>
-            <w:tcMar>
-              <w:top w:w="100" w:type="dxa"/>
-              <w:left w:w="100" w:type="dxa"/>
-              <w:bottom w:w="100" w:type="dxa"/>
-              <w:right w:w="100" w:type="dxa"/>
-            </w:tcMar>
-          </w:tcPr>
-          <w:p>
-            <w:pPr>
-              <w:rPr>
-                <w:lang w:val="en-US"/>
-              </w:rPr>
-            </w:pPr>
-            <w:proofErr w:type="spellStart"/>
-            <w:r>
-              <w:rPr>
-                <w:lang w:val="en-US"/>
-              </w:rPr>
-              <w:t>Geolocalisation</w:t>
-            </w:r>
-            <w:proofErr w:type="spellEnd"/>
-          </w:p>
-        </w:tc>
-        <w:tc>
-          <w:tcPr>
-            <w:tcW w:w="4970" w:type="dxa"/>
-            <w:tcBorders>
-              <w:top w:val="single" w:sz="4" w:space="0" w:color="000000" w:themeColor="text1"/>
-              <w:left w:val="single" w:sz="4" w:space="0" w:color="000000" w:themeColor="text1"/>
-              <w:bottom w:val="single" w:sz="4" w:space="0" w:color="000000" w:themeColor="text1"/>
-              <w:right w:val="single" w:sz="4" w:space="0" w:color="000000" w:themeColor="text1"/>
-            </w:tcBorders>
-            <w:shd w:val="clear" w:color="auto" w:fill="DCE6F1"/>
-            <w:tcMar>
-              <w:top w:w="100" w:type="dxa"/>
-              <w:left w:w="100" w:type="dxa"/>
-              <w:bottom w:w="100" w:type="dxa"/>
-              <w:right w:w="100" w:type="dxa"/>
-            </w:tcMar>
-          </w:tcPr>
-          <w:p>
-            <w:pPr>
-              <w:rPr>
-                <w:lang w:val="en-US"/>
-              </w:rPr>
-            </w:pPr>
-            <w:r>
-              <w:rPr>
-                <w:lang w:val="en-US"/>
-              </w:rPr>
-              <w:t>x (Implicit)</w:t>
-            </w:r>
-          </w:p>
-        </w:tc>
-        <w:tc>
-          <w:tcPr>
-            <w:tcW w:w="2520" w:type="dxa"/>
-            <w:tcBorders>
-              <w:top w:val="single" w:sz="4" w:space="0" w:color="000000" w:themeColor="text1"/>
-              <w:left w:val="single" w:sz="4" w:space="0" w:color="000000" w:themeColor="text1"/>
-              <w:bottom w:val="single" w:sz="4" w:space="0" w:color="000000" w:themeColor="text1"/>
-              <w:right w:val="single" w:sz="4" w:space="0" w:color="000000" w:themeColor="text1"/>
-            </w:tcBorders>
-            <w:shd w:val="clear" w:color="auto" w:fill="DCE6F1"/>
-            <w:tcMar>
-              <w:top w:w="100" w:type="dxa"/>
-              <w:left w:w="100" w:type="dxa"/>
-              <w:bottom w:w="100" w:type="dxa"/>
-              <w:right w:w="100" w:type="dxa"/>
-            </w:tcMar>
-          </w:tcPr>
-          <w:p>
-            <w:pPr>
-              <w:rPr>
-                <w:i/>
-                <w:iCs/>
-                <w:lang w:val="en-US"/>
-              </w:rPr>
-            </w:pPr>
-            <w:r>
-              <w:rPr>
-                <w:i/>
-                <w:iCs/>
-                <w:lang w:val="en-US"/>
-              </w:rPr>
-              <w:t>fichier.js</w:t>
-            </w:r>
-          </w:p>
-          <w:p>
-            <w:pPr>
-              <w:rPr>
-                <w:lang w:val="en-US"/>
-              </w:rPr>
-            </w:pPr>
-            <w:r>
-              <w:rPr>
-                <w:i/>
-                <w:iCs/>
-                <w:lang w:val="en-US"/>
-              </w:rPr>
-              <w:t>line</w:t>
-            </w:r>
-            <w:r>
-              <w:rPr>
-                <w:i/>
-                <w:iCs/>
-                <w:lang w:val="en-US"/>
-              </w:rPr>
-              <w:t>: XX</w:t>
-            </w:r>
-          </w:p>
-        </w:tc>
-      </w:tr>
-      <w:tr>
-        <w:tblPrEx>
-          <w:tblLook w:val="0600" w:firstRow="0" w:lastRow="0" w:firstColumn="0" w:lastColumn="0" w:noHBand="1" w:noVBand="1"/>
-        </w:tblPrEx>
-        <w:trPr>
-          <w:trHeight w:val="500"/>
-        </w:trPr>
-        <w:tc>
-          <w:tcPr>
-            <w:tcW w:w="1555" w:type="dxa"/>
-            <w:vMerge/>
-            <w:tcBorders>
-              <w:top w:val="single" w:sz="4" w:space="0" w:color="000000" w:themeColor="text1"/>
-              <w:left w:val="single" w:sz="4" w:space="0" w:color="000000" w:themeColor="text1"/>
-              <w:bottom w:val="single" w:sz="4" w:space="0" w:color="000000" w:themeColor="text1"/>
-              <w:right w:val="single" w:sz="4" w:space="0" w:color="000000" w:themeColor="text1"/>
-            </w:tcBorders>
-            <w:shd w:val="clear" w:color="auto" w:fill="DCE6F1"/>
-            <w:tcMar>
-              <w:top w:w="100" w:type="dxa"/>
-              <w:left w:w="100" w:type="dxa"/>
-              <w:bottom w:w="100" w:type="dxa"/>
-              <w:right w:w="100" w:type="dxa"/>
-            </w:tcMar>
-          </w:tcPr>
-          <w:p>
-            <w:pPr>
-              <w:rPr>
-                <w:lang w:val="en-US"/>
-              </w:rPr>
-            </w:pPr>
-          </w:p>
-        </w:tc>
-        <w:tc>
-          <w:tcPr>
-            <w:tcW w:w="7490" w:type="dxa"/>
-            <w:gridSpan w:val="2"/>
-            <w:tcBorders>
-              <w:top w:val="single" w:sz="4" w:space="0" w:color="000000" w:themeColor="text1"/>
-              <w:left w:val="single" w:sz="4" w:space="0" w:color="000000" w:themeColor="text1"/>
-              <w:bottom w:val="single" w:sz="4" w:space="0" w:color="000000" w:themeColor="text1"/>
-              <w:right w:val="single" w:sz="4" w:space="0" w:color="000000" w:themeColor="text1"/>
-            </w:tcBorders>
-            <w:shd w:val="clear" w:color="auto" w:fill="DCE6F1"/>
-            <w:tcMar>
-              <w:top w:w="100" w:type="dxa"/>
-              <w:left w:w="100" w:type="dxa"/>
-              <w:bottom w:w="100" w:type="dxa"/>
-              <w:right w:w="100" w:type="dxa"/>
-            </w:tcMar>
-          </w:tcPr>
-          <w:p>
-            <w:pPr>
-              <w:rPr>
-                <w:i/>
-                <w:iCs/>
-                <w:lang w:val="en-US"/>
-              </w:rPr>
-            </w:pPr>
-            <w:r>
-              <w:rPr>
-                <w:noProof/>
-                <w:highlight w:val="red"/>
-                <w:lang w:val="en-US"/>
-              </w:rPr>
-              <w:t>Your screenshot</w:t>
+                <w:lang w:val="en-US"/>
+              </w:rPr>
+              <w:drawing>
+                <wp:inline distT="0" distB="0" distL="0" distR="0" wp14:anchorId="7566BC97" wp14:editId="015DD755">
+                  <wp:extent cx="4629150" cy="153035"/>
+                  <wp:effectExtent l="0" t="0" r="0" b="0"/>
+                  <wp:docPr id="753247493" name="Image 1"/>
+                  <wp:cNvGraphicFramePr>
+                    <a:graphicFrameLocks xmlns:a="http://schemas.openxmlformats.org/drawingml/2006/main" noChangeAspect="1"/>
+                  </wp:cNvGraphicFramePr>
+                  <a:graphic xmlns:a="http://schemas.openxmlformats.org/drawingml/2006/main">
+                    <a:graphicData uri="http://schemas.openxmlformats.org/drawingml/2006/picture">
+                      <pic:pic xmlns:pic="http://schemas.openxmlformats.org/drawingml/2006/picture">
+                        <pic:nvPicPr>
+                          <pic:cNvPr id="753247493" name=""/>
+                          <pic:cNvPicPr/>
+                        </pic:nvPicPr>
+                        <pic:blipFill>
+                          <a:blip r:embed="rId30"/>
+                          <a:stretch>
+                            <a:fillRect/>
+                          </a:stretch>
+                        </pic:blipFill>
+                        <pic:spPr>
+                          <a:xfrm>
+                            <a:off x="0" y="0"/>
+                            <a:ext cx="4629150" cy="153035"/>
+                          </a:xfrm>
+                          <a:prstGeom prst="rect">
+                            <a:avLst/>
+                          </a:prstGeom>
+                        </pic:spPr>
+                      </pic:pic>
+                    </a:graphicData>
+                  </a:graphic>
+                </wp:inline>
+              </w:drawing>
+            </w:r>
+          </w:p>
+          <w:p>
+            <w:pPr>
+              <w:rPr>
+                <w:lang w:val="en-US"/>
+              </w:rPr>
+            </w:pPr>
+            <w:r>
+              <w:rPr>
+                <w:lang w:val="en-US"/>
+              </w:rPr>
+              <w:drawing>
+                <wp:inline distT="0" distB="0" distL="0" distR="0" wp14:anchorId="02C0DA93" wp14:editId="3B8DE96F">
+                  <wp:extent cx="4629150" cy="302260"/>
+                  <wp:effectExtent l="0" t="0" r="0" b="2540"/>
+                  <wp:docPr id="1431459941" name="Image 1"/>
+                  <wp:cNvGraphicFramePr>
+                    <a:graphicFrameLocks xmlns:a="http://schemas.openxmlformats.org/drawingml/2006/main" noChangeAspect="1"/>
+                  </wp:cNvGraphicFramePr>
+                  <a:graphic xmlns:a="http://schemas.openxmlformats.org/drawingml/2006/main">
+                    <a:graphicData uri="http://schemas.openxmlformats.org/drawingml/2006/picture">
+                      <pic:pic xmlns:pic="http://schemas.openxmlformats.org/drawingml/2006/picture">
+                        <pic:nvPicPr>
+                          <pic:cNvPr id="1431459941" name=""/>
+                          <pic:cNvPicPr/>
+                        </pic:nvPicPr>
+                        <pic:blipFill>
+                          <a:blip r:embed="rId31"/>
+                          <a:stretch>
+                            <a:fillRect/>
+                          </a:stretch>
+                        </pic:blipFill>
+                        <pic:spPr>
+                          <a:xfrm>
+                            <a:off x="0" y="0"/>
+                            <a:ext cx="4629150" cy="302260"/>
+                          </a:xfrm>
+                          <a:prstGeom prst="rect">
+                            <a:avLst/>
+                          </a:prstGeom>
+                        </pic:spPr>
+                      </pic:pic>
+                    </a:graphicData>
+                  </a:graphic>
+                </wp:inline>
+              </w:drawing>
             </w:r>
           </w:p>
         </w:tc>
@@ -4093,7 +4201,7 @@
       <w:pPr>
         <w:pStyle w:val="Titre1"/>
       </w:pPr>
-      <w:bookmarkStart w:id="1" w:name="_Toc233274080"/>
+      <w:bookmarkStart w:id="1" w:name="_Toc233310033"/>
       <w:r>
         <w:t>Lin</w:t>
       </w:r>
@@ -4119,15 +4227,37 @@
         <w:rPr>
           <w:lang w:val="en-US"/>
         </w:rPr>
-        <w:t xml:space="preserve">Link to source code: </w:t>
+        <w:t>Link to source code</w:t>
       </w:r>
       <w:r>
         <w:rPr>
           <w:lang w:val="en-US"/>
         </w:rPr>
-        <w:tab/>
-        <w:t>https://github.com/...</w:t>
+        <w:t xml:space="preserve"> (game)</w:t>
       </w:r>
+      <w:r>
+        <w:rPr>
+          <w:lang w:val="en-US"/>
+        </w:rPr>
+        <w:t xml:space="preserve">: </w:t>
+      </w:r>
+    </w:p>
+    <w:p>
+      <w:pPr>
+        <w:ind w:left="720"/>
+        <w:rPr>
+          <w:lang w:val="en-US"/>
+        </w:rPr>
+      </w:pPr>
+      <w:hyperlink r:id="rId32" w:history="1">
+        <w:r>
+          <w:rPr>
+            <w:rStyle w:val="Lienhypertexte"/>
+            <w:lang w:val="en-US"/>
+          </w:rPr>
+          <w:t>https://github.com/LucasTornare/64-31_RadioactiveDuckGame</w:t>
+        </w:r>
+      </w:hyperlink>
     </w:p>
     <w:p>
       <w:pPr>
@@ -4143,6 +4273,65 @@
         <w:rPr>
           <w:lang w:val="en-US"/>
         </w:rPr>
+        <w:t>Link to source code</w:t>
+      </w:r>
+      <w:r>
+        <w:rPr>
+          <w:lang w:val="en-US"/>
+        </w:rPr>
+        <w:t xml:space="preserve"> (</w:t>
+      </w:r>
+      <w:r>
+        <w:rPr>
+          <w:lang w:val="en-US"/>
+        </w:rPr>
+        <w:t>react</w:t>
+      </w:r>
+      <w:r>
+        <w:rPr>
+          <w:lang w:val="en-US"/>
+        </w:rPr>
+        <w:t>)</w:t>
+      </w:r>
+      <w:r>
+        <w:rPr>
+          <w:lang w:val="en-US"/>
+        </w:rPr>
+        <w:t xml:space="preserve">: </w:t>
+      </w:r>
+    </w:p>
+    <w:p>
+      <w:pPr>
+        <w:ind w:left="720"/>
+        <w:rPr>
+          <w:lang w:val="en-US"/>
+        </w:rPr>
+      </w:pPr>
+      <w:hyperlink r:id="rId33" w:history="1">
+        <w:r>
+          <w:rPr>
+            <w:rStyle w:val="Lienhypertexte"/>
+            <w:lang w:val="en-US"/>
+          </w:rPr>
+          <w:t>https://github.com/LucasTornare/64-31_webdevelopment_react_group_b</w:t>
+        </w:r>
+      </w:hyperlink>
+    </w:p>
+    <w:p>
+      <w:pPr>
+        <w:numPr>
+          <w:ilvl w:val="0"/>
+          <w:numId w:val="1"/>
+        </w:numPr>
+        <w:rPr>
+          <w:lang w:val="en-US"/>
+        </w:rPr>
+      </w:pPr>
+      <w:r>
+        <w:rPr>
+          <w:lang w:val="en-US"/>
+        </w:rPr>
+        <w:lastRenderedPageBreak/>
         <w:t xml:space="preserve">Link to demo: </w:t>
       </w:r>
       <w:r>
@@ -4150,12 +4339,54 @@
           <w:lang w:val="en-US"/>
         </w:rPr>
         <w:tab/>
-        <w:t>https://www....</w:t>
+      </w:r>
+      <w:hyperlink r:id="rId34" w:history="1">
+        <w:r>
+          <w:rPr>
+            <w:rStyle w:val="Lienhypertexte"/>
+            <w:lang w:val="en-US"/>
+          </w:rPr>
+          <w:t>https://lucastornare.github.io/64-31_RadioactiveDuckGame/</w:t>
+        </w:r>
+      </w:hyperlink>
+    </w:p>
+    <w:p>
+      <w:pPr>
+        <w:numPr>
+          <w:ilvl w:val="0"/>
+          <w:numId w:val="1"/>
+        </w:numPr>
+        <w:rPr>
+          <w:lang w:val="en-US"/>
+        </w:rPr>
+      </w:pPr>
+      <w:r>
+        <w:rPr>
+          <w:lang w:val="en-US"/>
+        </w:rPr>
+        <w:t xml:space="preserve">Link to website: </w:t>
       </w:r>
     </w:p>
+    <w:p>
+      <w:pPr>
+        <w:ind w:left="720"/>
+        <w:rPr>
+          <w:lang w:val="en-US"/>
+        </w:rPr>
+      </w:pPr>
+      <w:hyperlink r:id="rId35" w:history="1">
+        <w:r>
+          <w:rPr>
+            <w:rStyle w:val="Lienhypertexte"/>
+            <w:lang w:val="en-US"/>
+          </w:rPr>
+          <w:t>https://radioactive-duck-fdacdkdmbsfndged.switzerlandnorth-01.azurewebsites.net/description</w:t>
+        </w:r>
+      </w:hyperlink>
+    </w:p>
     <w:sectPr>
-      <w:headerReference w:type="default" r:id="rId18"/>
-      <w:footerReference w:type="default" r:id="rId19"/>
+      <w:headerReference w:type="default" r:id="rId36"/>
+      <w:footerReference w:type="default" r:id="rId37"/>
       <w:pgSz w:w="11909" w:h="16834"/>
       <w:pgMar w:top="1985" w:right="1440" w:bottom="1440" w:left="1440" w:header="0" w:footer="720" w:gutter="0"/>
       <w:pgNumType w:start="1"/>
@@ -5052,7 +5283,7 @@
   <w:style w:type="paragraph" w:default="1" w:styleId="Normal">
     <w:name w:val="Normal"/>
     <w:qFormat/>
-    <w:rsid w:val="00A16EDC"/>
+    <w:rsid w:val="00543C64"/>
   </w:style>
   <w:style w:type="paragraph" w:styleId="Titre1">
     <w:name w:val="heading 1"/>
@@ -5278,7 +5509,6 @@
   <w:style w:type="character" w:default="1" w:styleId="Policepardfaut">
     <w:name w:val="Default Paragraph Font"/>
     <w:uiPriority w:val="1"/>
-    <w:semiHidden/>
     <w:unhideWhenUsed/>
   </w:style>
   <w:style w:type="table" w:default="1" w:styleId="TableauNormal">
@@ -5535,6 +5765,18 @@
       <w:color w:val="272727" w:themeColor="text1" w:themeTint="D8"/>
       <w:sz w:val="21"/>
       <w:szCs w:val="21"/>
+    </w:rPr>
+  </w:style>
+  <w:style w:type="character" w:styleId="Mentionnonrsolue">
+    <w:name w:val="Unresolved Mention"/>
+    <w:basedOn w:val="Policepardfaut"/>
+    <w:uiPriority w:val="99"/>
+    <w:semiHidden/>
+    <w:unhideWhenUsed/>
+    <w:rsid w:val="00543C64"/>
+    <w:rPr>
+      <w:color w:val="605E5C"/>
+      <w:shd w:val="clear" w:color="auto" w:fill="E1DFDD"/>
     </w:rPr>
   </w:style>
 </w:styles>
@@ -5861,18 +6103,18 @@
 </file>
 
 <file path=customXml/item1.xml><?xml version="1.0" encoding="utf-8"?>
+<p:properties xmlns:p="http://schemas.microsoft.com/office/2006/metadata/properties" xmlns:xsi="http://www.w3.org/2001/XMLSchema-instance" xmlns:pc="http://schemas.microsoft.com/office/infopath/2007/PartnerControls">
+  <documentManagement/>
+</p:properties>
+</file>
+
+<file path=customXml/item2.xml><?xml version="1.0" encoding="utf-8"?>
 <?mso-contentType ?>
 <FormTemplates xmlns="http://schemas.microsoft.com/sharepoint/v3/contenttype/forms">
   <Display>DocumentLibraryForm</Display>
   <Edit>DocumentLibraryForm</Edit>
   <New>DocumentLibraryForm</New>
 </FormTemplates>
-</file>
-
-<file path=customXml/item2.xml><?xml version="1.0" encoding="utf-8"?>
-<p:properties xmlns:p="http://schemas.microsoft.com/office/2006/metadata/properties" xmlns:xsi="http://www.w3.org/2001/XMLSchema-instance" xmlns:pc="http://schemas.microsoft.com/office/infopath/2007/PartnerControls">
-  <documentManagement/>
-</p:properties>
 </file>
 
 <file path=customXml/item3.xml><?xml version="1.0" encoding="utf-8"?>
@@ -6020,18 +6262,18 @@
 </file>
 
 <file path=customXml/itemProps1.xml><?xml version="1.0" encoding="utf-8"?>
-<ds:datastoreItem xmlns:ds="http://schemas.openxmlformats.org/officeDocument/2006/customXml" ds:itemID="{1603A811-75EC-44E2-8D32-EB1BBF220462}">
+<ds:datastoreItem xmlns:ds="http://schemas.openxmlformats.org/officeDocument/2006/customXml" ds:itemID="{87BBC240-EA16-4772-973A-220F1052DF33}">
   <ds:schemaRefs>
-    <ds:schemaRef ds:uri="http://schemas.microsoft.com/sharepoint/v3/contenttype/forms"/>
+    <ds:schemaRef ds:uri="http://schemas.microsoft.com/office/2006/metadata/properties"/>
+    <ds:schemaRef ds:uri="http://schemas.microsoft.com/office/infopath/2007/PartnerControls"/>
   </ds:schemaRefs>
 </ds:datastoreItem>
 </file>
 
 <file path=customXml/itemProps2.xml><?xml version="1.0" encoding="utf-8"?>
-<ds:datastoreItem xmlns:ds="http://schemas.openxmlformats.org/officeDocument/2006/customXml" ds:itemID="{87BBC240-EA16-4772-973A-220F1052DF33}">
+<ds:datastoreItem xmlns:ds="http://schemas.openxmlformats.org/officeDocument/2006/customXml" ds:itemID="{1603A811-75EC-44E2-8D32-EB1BBF220462}">
   <ds:schemaRefs>
-    <ds:schemaRef ds:uri="http://schemas.microsoft.com/office/2006/metadata/properties"/>
-    <ds:schemaRef ds:uri="http://schemas.microsoft.com/office/infopath/2007/PartnerControls"/>
+    <ds:schemaRef ds:uri="http://schemas.microsoft.com/sharepoint/v3/contenttype/forms"/>
   </ds:schemaRefs>
 </ds:datastoreItem>
 </file>

</xml_diff>